<commit_message>
Apply 감수리포트 corrections and sync latest docs
- Fix hero gradient to uniform overlay (stat labels now visible)
- Remove all '자동 전환' wording (출자금 ≠ 입주보증금)
- Rename '6대 핵심 사업' → '5대 사회적기업' across all pages
- Remove version numbers ('백서 v11' → 버전 없는 표현)
- Correct 잉여금 distribution (75/15/10/배당0)
- Fix 지자체 to 괴산·포천·가평(완성) / 양평(협의중) / remove 여주·연천
- Update 아동 count to 1개소 5~7명, 전체 약 30명
- Add 청년/장애인 to 5대 돌봄 vision cards
- about: 4개사 → 5개사
- Sync latest docx files from 최종본 to docs/

Co-Authored-By: Claude Sonnet 4.6 <noreply@anthropic.com>
</commit_message>
<xml_diff>
--- a/docs/자연돌봄공동체_ESG파트너십제안서.docx
+++ b/docs/자연돌봄공동체_ESG파트너십제안서.docx
@@ -1336,7 +1336,7 @@
         <w:pStyle w:val="Heading2"/>
       </w:pPr>
       <w:r>
-        <w:t xml:space="preserve">4-2. 4대 연계형 독립 사회적기업</w:t>
+        <w:t xml:space="preserve">4-2. 5대 연계형 독립 사회적기업</w:t>
       </w:r>
     </w:p>
     <w:tbl>
@@ -1504,7 +1504,7 @@
               <w:spacing w:after="20" w:line="252"/>
             </w:pPr>
             <w:r>
-              <w:t xml:space="preserve">스마트팜</w:t>
+              <w:t xml:space="preserve">농업</w:t>
             </w:r>
           </w:p>
         </w:tc>
@@ -1531,7 +1531,7 @@
               <w:spacing w:after="20" w:line="252"/>
             </w:pPr>
             <w:r>
-              <w:t xml:space="preserve">유휴지 기반 ICT 유기농 작물·친환경 식자재 생산·유통</w:t>
+              <w:t xml:space="preserve">ICT 스마트팜·치유농업·친환경 식자재 생산·유통</w:t>
             </w:r>
           </w:p>
         </w:tc>
@@ -1559,7 +1559,7 @@
               <w:spacing w:after="20" w:line="252"/>
             </w:pPr>
             <w:r>
-              <w:t xml:space="preserve">반려동물센터</w:t>
+              <w:t xml:space="preserve">임업</w:t>
             </w:r>
           </w:p>
         </w:tc>
@@ -1585,7 +1585,7 @@
               <w:spacing w:after="20" w:line="252"/>
             </w:pPr>
             <w:r>
-              <w:t xml:space="preserve">유기견 구조·사회화 훈련 및 산림 연계 치유 프로그램</w:t>
+              <w:t xml:space="preserve">숲치유·임산물 채취·가공·숲가꾸기(산림복지서비스)</w:t>
             </w:r>
           </w:p>
         </w:tc>
@@ -1614,6 +1614,61 @@
               <w:spacing w:after="20" w:line="252"/>
             </w:pPr>
             <w:r>
+              <w:t xml:space="preserve">반려동물센터</w:t>
+            </w:r>
+          </w:p>
+        </w:tc>
+        <w:tc>
+          <w:tcPr>
+            <w:tcW w:type="dxa" w:w="6960"/>
+            <w:tcBorders>
+              <w:top w:val="single" w:color="BDBDBD" w:sz="1"/>
+              <w:left w:val="single" w:color="BDBDBD" w:sz="1"/>
+              <w:bottom w:val="single" w:color="BDBDBD" w:sz="1"/>
+              <w:right w:val="single" w:color="BDBDBD" w:sz="1"/>
+            </w:tcBorders>
+            <w:shd w:fill="F2F2F2" w:val="clear"/>
+            <w:tcMar>
+              <w:top w:type="dxa" w:w="60"/>
+              <w:left w:type="dxa" w:w="110"/>
+              <w:bottom w:type="dxa" w:w="60"/>
+              <w:right w:type="dxa" w:w="110"/>
+            </w:tcMar>
+            <w:vAlign w:val="center"/>
+          </w:tcPr>
+          <w:p>
+            <w:pPr>
+              <w:spacing w:after="20" w:line="252"/>
+            </w:pPr>
+            <w:r>
+              <w:t xml:space="preserve">유기견 구조·사회화 훈련 및 산림 연계 치유 프로그램</w:t>
+            </w:r>
+          </w:p>
+        </w:tc>
+      </w:tr>
+      <w:tr>
+        <w:tc>
+          <w:tcPr>
+            <w:tcW w:type="dxa" w:w="2400"/>
+            <w:tcBorders>
+              <w:top w:val="single" w:color="BDBDBD" w:sz="1"/>
+              <w:left w:val="single" w:color="BDBDBD" w:sz="1"/>
+              <w:bottom w:val="single" w:color="BDBDBD" w:sz="1"/>
+              <w:right w:val="single" w:color="BDBDBD" w:sz="1"/>
+            </w:tcBorders>
+            <w:tcMar>
+              <w:top w:type="dxa" w:w="60"/>
+              <w:left w:type="dxa" w:w="110"/>
+              <w:bottom w:type="dxa" w:w="60"/>
+              <w:right w:type="dxa" w:w="110"/>
+            </w:tcMar>
+            <w:vAlign w:val="center"/>
+          </w:tcPr>
+          <w:p>
+            <w:pPr>
+              <w:spacing w:after="20" w:line="252"/>
+            </w:pPr>
+            <w:r>
               <w:t xml:space="preserve">신재생에너지</w:t>
             </w:r>
           </w:p>
@@ -1627,7 +1682,6 @@
               <w:bottom w:val="single" w:color="BDBDBD" w:sz="1"/>
               <w:right w:val="single" w:color="BDBDBD" w:sz="1"/>
             </w:tcBorders>
-            <w:shd w:fill="F2F2F2" w:val="clear"/>
             <w:tcMar>
               <w:top w:type="dxa" w:w="60"/>
               <w:left w:type="dxa" w:w="110"/>
@@ -3310,7 +3364,7 @@
               <w:spacing w:after="20" w:line="252"/>
             </w:pPr>
             <w:r>
-              <w:t xml:space="preserve">복지위탁 + 4대 사회적기업 매출 + ESG 후원 + 돌봄코인 내부순환이 상호 교차 → 단일 재원 고갈 리스크 차단</w:t>
+              <w:t xml:space="preserve">복지위탁 + 5대 사회적기업 매출 + ESG 후원 + 돌봄코인 내부순환이 상호 교차 → 단일 재원 고갈 리스크 차단</w:t>
             </w:r>
           </w:p>
         </w:tc>

</xml_diff>